<commit_message>
Corrigir lista de publicações com dados verificados do ORCID
Substitui a lista aproximada de artigos por referências exatas (autores,
periódico, data e DOI) extraídas diretamente do registro ORCID
(0000-0002-6484-6991), separando artigos indexados de apresentações em
congressos. Adiciona Scopus Author ID e ResearcherID ao contato, e uma
seção de apresentações no docx gerado.

Co-Authored-By: Claude Sonnet 5 <noreply@anthropic.com>
Claude-Session: https://claude.ai/code/session_01TaUyKXER4UZ6w2rYF5sdFR
</commit_message>
<xml_diff>
--- a/auto-jobs/data/resume_base.docx
+++ b/auto-jobs/data/resume_base.docx
@@ -371,7 +371,7 @@
         <w:pStyle w:val="ListBullet"/>
       </w:pPr>
       <w:r>
-        <w:t>Pereira-Júnior AA; Lima FHDM; Martins IF; Silva RSF; Lucas EPR. Reducing time in lethality assay (LD50) for Bothrops jararaca and Crotalus durissus terrificus venoms. Toxicon, v. 262, 2025.</w:t>
+        <w:t>Bacellar DTL, Silva CS, Pereira-Júnior AA, Correa de Moura W, Villas-Boas MHS, Mattos-Guaraldi AL. Diphtheria antitoxin potency assay: an in vitro alternative to the in vivo subcutaneous toxin neutralization test. Biologicals, 2026-02. DOI: 10.1016/j.biologicals.2025.101870</w:t>
       </w:r>
     </w:p>
     <w:p>
@@ -379,7 +379,55 @@
         <w:pStyle w:val="ListBullet"/>
       </w:pPr>
       <w:r>
-        <w:t>Bacellar DTL; Silva CS; Pereira-Júnior AA; et al. Diphtheria antitoxin potency assay: an in vitro alternative to the in vivo subcutaneous toxin neutralization test. Biologicals, v. 93, 2025.</w:t>
+        <w:t>Pereira-Júnior AA, Lima FHD, Martins IF, Fructuoso da Silva RS, Reis Lucas EP. Reducing time in lethality assay (LD50) for Bothrops jararaca and Crotalus durissus terrificus venoms and lethality neutralizing assay (ED50) for their respective antivenoms: A 3Rs-based retrospective data validation. Toxicon, 2025-07. DOI: 10.1016/j.toxicon.2025.108358</w:t>
+      </w:r>
+    </w:p>
+    <w:p>
+      <w:pPr>
+        <w:pStyle w:val="ListBullet"/>
+      </w:pPr>
+      <w:r>
+        <w:t>Silva AO, Ribeiro JM, Patrocínio TB, Amorim GES, Pereira-Júnior AA, et al. Protective Effects of Kefir Against Unpredictable Chronic Stress Alterations in Mice Central Nervous System, Heart, and Kidney. Probiotics and Antimicrobial Proteins, 2023-04. DOI: 10.1007/s12602-022-10031-9</w:t>
+      </w:r>
+    </w:p>
+    <w:p>
+      <w:pPr>
+        <w:pStyle w:val="ListBullet"/>
+      </w:pPr>
+      <w:r>
+        <w:t>Pereira Júnior AA, Amorim GES, Garcia RCT, Ribeiro JM, Silva AO, et al. Nicotine exposure through breastfeeding affects brain-derived neurotrophic factor and synaptic proteins levels in the brain of stressed adult female mice. International Journal of Developmental Neuroscience, 2022-12. DOI: 10.1002/jdn.10227</w:t>
+      </w:r>
+    </w:p>
+    <w:p>
+      <w:pPr>
+        <w:pStyle w:val="ListBullet"/>
+      </w:pPr>
+      <w:r>
+        <w:t>Almeida CAF, Pereira-Junior AA, Rangel JG, Pereira BP, Costa KCM, et al. Ayahuasca, a psychedelic beverage, modulates neuroplasticity induced by ethanol in mice. Behavioural Brain Research, 2022-01. DOI: 10.1016/j.bbr.2021.113546</w:t>
+      </w:r>
+    </w:p>
+    <w:p>
+      <w:pPr>
+        <w:pStyle w:val="ListBullet"/>
+      </w:pPr>
+      <w:r>
+        <w:t>Antimicrobial stewardship for surgical antibiotic prophylaxis and surgical site infections: a systematic review. International Journal of Clinical Pharmacy, 2021-11. DOI: 10.1007/s11096-021-01358-4</w:t>
+      </w:r>
+    </w:p>
+    <w:p>
+      <w:pPr>
+        <w:pStyle w:val="ListBullet"/>
+      </w:pPr>
+      <w:r>
+        <w:t>Souza MM, Vechiato FMV, Debarba LK, Leao RM, Dias MVS, Pereira AA, Cruz JC, Elias LLK, Antunes-Rodrigues J, Ruginsk SG. Effects of hyperosmolality on hypothalamic astrocytic area, mRNA expression and glutamate balance in vitro. Neuroscience, 2020-06. DOI: 10.1016/j.neuroscience.2020.06.029</w:t>
+      </w:r>
+    </w:p>
+    <w:p>
+      <w:pPr>
+        <w:pStyle w:val="Heading1"/>
+      </w:pPr>
+      <w:r>
+        <w:t>Apresentações e Congressos</w:t>
       </w:r>
     </w:p>
     <w:p>
@@ -411,7 +459,7 @@
         <w:pStyle w:val="ListBullet"/>
       </w:pPr>
       <w:r>
-        <w:t>Autor/coautor de 7 artigos completos em periódicos indexados (Toxicon, Biologicals, Behavioural Brain Research, International Journal of Developmental Neuroscience, Neuroscience, International Journal of Clinical Pharmacy, Probiotics and Antimicrobial Proteins), 2 resumos expandidos e mais de 45 resumos/apresentações em congressos — mais de 60 produções científicas e técnicas no total.</w:t>
+        <w:t>Mais de 45 resumos/apresentações em congressos nacionais e internacionais e 18 Procedimentos Operacionais Padrão institucionais (INCQS/Fiocruz) — mais de 60 produções científicas e técnicas no total.</w:t>
       </w:r>
     </w:p>
     <w:p>

</xml_diff>

<commit_message>
Enriquecer currículo com dados do Lattes (prêmios e orientações)
Extrai do Currículo Lattes completo: 5 menções honrosas em congressos/
simpósios, orientação de residentes e monografias de especialização
(concluídas e em andamento), participação em bancas e representação
estudantil no CONSEPE/UNIFAL. Adiciona seções correspondentes no
render do docx.

GitHub e LinkedIn públicos não trouxeram informação adicional
relevante (perfil GitHub sem outros repositórios; LinkedIn bloqueou
acesso automatizado).

Co-Authored-By: Claude Sonnet 5 <noreply@anthropic.com>
Claude-Session: https://claude.ai/code/session_01TaUyKXER4UZ6w2rYF5sdFR
</commit_message>
<xml_diff>
--- a/auto-jobs/data/resume_base.docx
+++ b/auto-jobs/data/resume_base.docx
@@ -268,6 +268,14 @@
     </w:p>
     <w:p>
       <w:pPr>
+        <w:pStyle w:val="ListBullet"/>
+      </w:pPr>
+      <w:r>
+        <w:t>Representante discente titular no Conselho de Ensino, Pesquisa e Extensão (CONSEPE) da UNIFAL-MG (2019) e Coordenador de Extensão do Centro Acadêmico de Biomedicina (2016).</w:t>
+      </w:r>
+    </w:p>
+    <w:p>
+      <w:pPr>
         <w:pStyle w:val="Heading1"/>
       </w:pPr>
       <w:r>
@@ -356,6 +364,14 @@
       </w:pPr>
       <w:r>
         <w:t>Ferramentas de bioinformática aplicadas à saúde (FeSBE, 2020)</w:t>
+      </w:r>
+    </w:p>
+    <w:p>
+      <w:pPr>
+        <w:pStyle w:val="ListBullet"/>
+      </w:pPr>
+      <w:r>
+        <w:t>Workshop de Inovação em Ciência em Animais de Laboratório - InovaCal (ICTB/Fiocruz, 2022, 8h)</w:t>
       </w:r>
     </w:p>
     <w:p>
@@ -460,6 +476,126 @@
       </w:pPr>
       <w:r>
         <w:t>Mais de 45 resumos/apresentações em congressos nacionais e internacionais e 18 Procedimentos Operacionais Padrão institucionais (INCQS/Fiocruz) — mais de 60 produções científicas e técnicas no total.</w:t>
+      </w:r>
+    </w:p>
+    <w:p>
+      <w:pPr>
+        <w:pStyle w:val="Heading1"/>
+      </w:pPr>
+      <w:r>
+        <w:t>Orientação e Supervisão Acadêmica</w:t>
+      </w:r>
+    </w:p>
+    <w:p>
+      <w:pPr>
+        <w:pStyle w:val="ListBullet"/>
+      </w:pPr>
+      <w:r>
+        <w:t>Em andamento: Kelly Cristina de Souza — Comparação entre anestesia dissociativa e inalatória na punção cardíaca de cobaias: impacto na viabilidade celular em ensaios in vitro para determinação da potência de vacinas e soros antidiftéricos (Residência Multiprofissional em Saúde, Fiocruz, início 2024).</w:t>
+      </w:r>
+    </w:p>
+    <w:p>
+      <w:pPr>
+        <w:pStyle w:val="ListBullet"/>
+      </w:pPr>
+      <w:r>
+        <w:t>Concluída (2025): Leticia Santana de Rezende — Estudo colaborativo para calibração do Padrão Nacional de Antitoxina Tetânica (Residência Multiprofissional em Saúde, Fiocruz).</w:t>
+      </w:r>
+    </w:p>
+    <w:p>
+      <w:pPr>
+        <w:pStyle w:val="ListBullet"/>
+      </w:pPr>
+      <w:r>
+        <w:t>Concluída (2024): Isadora Florentino Martins — Refinamento para os ensaios de potência de soro antidiftérico e componente diftérico em vacinas: estabelecimento de escores clínicos para implementação de ponto final humanitário (Residência Multiprofissional em Saúde, Fiocruz).</w:t>
+      </w:r>
+    </w:p>
+    <w:p>
+      <w:pPr>
+        <w:pStyle w:val="ListBullet"/>
+      </w:pPr>
+      <w:r>
+        <w:t>Concluída (2021): TCC de Giovana de Cassia Pan e Maria Paula Souza Silva Alves — Padronização de modelos animais de estresse crônico utilizando camundongo Swiss (Graduação em Farmácia, UNIFAL-MG).</w:t>
+      </w:r>
+    </w:p>
+    <w:p>
+      <w:pPr>
+        <w:pStyle w:val="ListBullet"/>
+      </w:pPr>
+      <w:r>
+        <w:t>Iniciações científicas concluídas (2020): Maria Paula Souza Silva Alves e Giovana de Cassia Pan (Graduação em Farmácia, UNIFAL-MG, bolsas FAPEMIG/CNPq).</w:t>
+      </w:r>
+    </w:p>
+    <w:p>
+      <w:pPr>
+        <w:pStyle w:val="ListBullet"/>
+      </w:pPr>
+      <w:r>
+        <w:t>Participação em 3 bancas examinadoras de monografia de especialização em Residência Multiprofissional em Saúde (Fiocruz, 2024-2025): controle estatístico de processo, contagem celular (corantes Azul de Tripan e Eritrosina B) e seleção de lote de referência para vacina de hepatite B.</w:t>
+      </w:r>
+    </w:p>
+    <w:p>
+      <w:pPr>
+        <w:pStyle w:val="Heading1"/>
+      </w:pPr>
+      <w:r>
+        <w:t>Prêmios e Menções Honrosas</w:t>
+      </w:r>
+    </w:p>
+    <w:p>
+      <w:pPr>
+        <w:pStyle w:val="ListBullet"/>
+      </w:pPr>
+      <w:r>
+        <w:t>Menção Honrosa — Refinamento da punção cardíaca em cobaias (Cavia porcellus) com o uso de anestesia inalatória em substituição à anestesia dissociativa. XI Jornada Científica do INCQS/Fiocruz, 2024.</w:t>
+      </w:r>
+    </w:p>
+    <w:p>
+      <w:pPr>
+        <w:pStyle w:val="ListBullet"/>
+      </w:pPr>
+      <w:r>
+        <w:t>Menção Honrosa — Implementação dos princípios 3Rs: Redução da duração do teste de letalidade em camundongos para determinação da potência de soros antibotrópicos e anticrotálicos. Simpósio Saúde Pública e Acidentes por Animais Peçonhentos, Instituto Vital Brazil, 2024.</w:t>
+      </w:r>
+    </w:p>
+    <w:p>
+      <w:pPr>
+        <w:pStyle w:val="ListBullet"/>
+      </w:pPr>
+      <w:r>
+        <w:t>Menção Honrosa — Estabelecimento de escores clínicos e ponto final humanitário para o refinamento dos ensaios de potência de vacinas contra difteria e soros antidiftéricos. VIII Seminário de Ciência e Tecnologia em Biomodelos, ICTB/Fiocruz, 2023.</w:t>
+      </w:r>
+    </w:p>
+    <w:p>
+      <w:pPr>
+        <w:pStyle w:val="ListBullet"/>
+      </w:pPr>
+      <w:r>
+        <w:t>Menção Honrosa — Exposição combinada a nicotina durante o período pós-natal e na atividade locomotora em camundongos Swiss. VI Simpósio Integrado da UNIFAL-MG, 2020.</w:t>
+      </w:r>
+    </w:p>
+    <w:p>
+      <w:pPr>
+        <w:pStyle w:val="ListBullet"/>
+      </w:pPr>
+      <w:r>
+        <w:t>Menção Honrosa — Antimicrobial stewardship: garantia de adesão aos protocolos de antibioticoprofilaxia cirúrgica. II Workshop do PPGCF/UNIFAL-MG, 2020.</w:t>
+      </w:r>
+    </w:p>
+    <w:p>
+      <w:pPr>
+        <w:pStyle w:val="ListBullet"/>
+      </w:pPr>
+      <w:r>
+        <w:t>Menção Honrosa — Efeito do extrato aquoso de Equisetum arvense sobre os parâmetros bioquímicos e hematológicos em ratos com hepatite medicamentosa. IV Jornada de Biomedicina, UNIFAL-MG, 2016.</w:t>
+      </w:r>
+    </w:p>
+    <w:p>
+      <w:pPr>
+        <w:pStyle w:val="ListBullet"/>
+      </w:pPr>
+      <w:r>
+        <w:t>1º colocado no processo seletivo de Mestrado do Programa de Pós-Graduação em Ciências Farmacêuticas da UNIFAL-MG (2018).</w:t>
       </w:r>
     </w:p>
     <w:p>

</xml_diff>